<commit_message>
Present project with concise documentation set
</commit_message>
<xml_diff>
--- a/Project Planning/DOCX Version/01-Architecture-Overview.docx
+++ b/Project Planning/DOCX Version/01-Architecture-Overview.docx
@@ -5,52 +5,48 @@
     <w:p>
       <w:pPr>
         <w:pStyle w:val="Heading1"/>
+        <w:jc w:val="center"/>
       </w:pPr>
       <w:r>
         <w:t>01 Architecture Overview</w:t>
       </w:r>
     </w:p>
     <w:p>
-      <w:pPr>
-        <w:pStyle w:val="Heading1"/>
-      </w:pPr>
       <w:r>
         <w:t>Java Application on AWS EKS</w:t>
       </w:r>
     </w:p>
     <w:p>
-      <w:pPr>
-        <w:pStyle w:val="Heading2"/>
-      </w:pPr>
       <w:r>
-        <w:t>Accurate Project Title</w:t>
+        <w:t>Project Title</w:t>
       </w:r>
     </w:p>
     <w:p>
-      <w:pPr>
-        <w:pStyle w:val="Heading2"/>
-      </w:pPr>
       <w:r>
-        <w:t>Jenkins CI and Argo CD GitOps Deployment of a Java Application on Amazon EKS</w:t>
+        <w:t>Jenkins CI and Argo CD GitOps Deployment of an Application on Amazon EKS</w:t>
       </w:r>
     </w:p>
     <w:p>
-      <w:pPr>
-        <w:pStyle w:val="Heading2"/>
-      </w:pPr>
       <w:r>
         <w:t>Purpose</w:t>
       </w:r>
     </w:p>
     <w:p>
       <w:r>
-        <w:t>This project demonstrates how a Java web application can be built, tested, scanned, containerized, and deployed to Kubernetes on AWS. It is a hands-on DevOps project, not a production claim.</w:t>
+        <w:t>This project demonstrates how a Java web application can be built, tested, scanned,</w:t>
       </w:r>
     </w:p>
     <w:p>
-      <w:pPr>
-        <w:pStyle w:val="Heading2"/>
-      </w:pPr>
+      <w:r>
+        <w:t>containerized, and deployed to Kubernetes on AWS. It is a hands-on DevOps project,</w:t>
+      </w:r>
+    </w:p>
+    <w:p>
+      <w:r>
+        <w:t>not a production claim.</w:t>
+      </w:r>
+    </w:p>
+    <w:p>
       <w:r>
         <w:t>Current Architecture</w:t>
       </w:r>
@@ -62,215 +58,167 @@
     </w:p>
     <w:p>
       <w:r>
-        <w:t xml:space="preserve">    Developer[Developer] --&gt; AppGit[GitHub App Repository]</w:t>
+        <w:t>Developer[Developer] --&gt; AppGit[GitHub App Repository]</w:t>
       </w:r>
     </w:p>
     <w:p>
       <w:r>
-        <w:t xml:space="preserve">    AppGit --&gt; Jenkins[Jenkins CI]</w:t>
+        <w:t>AppGit --&gt; Jenkins[Jenkins CI]</w:t>
       </w:r>
     </w:p>
     <w:p>
       <w:r>
-        <w:t xml:space="preserve">    Jenkins --&gt; Maven[Maven Build and Tests]</w:t>
+        <w:t>Jenkins --&gt; Maven[Maven Build and Tests]</w:t>
       </w:r>
     </w:p>
     <w:p>
       <w:r>
-        <w:t xml:space="preserve">    Maven --&gt; Sonar[SonarQube Analysis]</w:t>
+        <w:t>Maven --&gt; Sonar[SonarQube Analysis]</w:t>
       </w:r>
     </w:p>
     <w:p>
       <w:r>
-        <w:t xml:space="preserve">    Sonar --&gt; Docker[Docker Image Build]</w:t>
+        <w:t>Sonar --&gt; Docker[Docker Image Build]</w:t>
       </w:r>
     </w:p>
     <w:p>
       <w:r>
-        <w:t xml:space="preserve">    Docker --&gt; Trivy[Trivy Vulnerability Scan]</w:t>
+        <w:t>Docker --&gt; Trivy[Trivy Vulnerability Scan]</w:t>
       </w:r>
     </w:p>
     <w:p>
       <w:r>
-        <w:t xml:space="preserve">    Trivy --&gt; Registry[Docker Hub]</w:t>
+        <w:t>Trivy --&gt; Registry[Docker Hub]</w:t>
       </w:r>
     </w:p>
     <w:p>
       <w:r>
-        <w:t xml:space="preserve">    Jenkins --&gt;|Update image tag| GitOps[GitHub GitOps Repository]</w:t>
+        <w:t>Jenkins --&gt;|Update image tag| GitOps[GitHub GitOps Repository]</w:t>
       </w:r>
     </w:p>
     <w:p>
       <w:r>
-        <w:t xml:space="preserve">    GitOps --&gt; Argo[Argo CD]</w:t>
+        <w:t>GitOps --&gt; Argo[Argo CD]</w:t>
       </w:r>
     </w:p>
     <w:p>
       <w:r>
-        <w:t xml:space="preserve">    Argo --&gt; EKS[Amazon EKS]</w:t>
+        <w:t>Argo --&gt; EKS[Amazon EKS]</w:t>
       </w:r>
     </w:p>
     <w:p>
       <w:r>
-        <w:t xml:space="preserve">    EKS --&gt; App[Java App Pods]</w:t>
+        <w:t>EKS --&gt; App[Java App Pods]</w:t>
       </w:r>
     </w:p>
     <w:p>
       <w:r>
-        <w:t xml:space="preserve">    App --&gt; Service[Kubernetes LoadBalancer Service]</w:t>
+        <w:t>App --&gt; Service[Kubernetes LoadBalancer Service]</w:t>
       </w:r>
     </w:p>
     <w:p>
       <w:r>
-        <w:t xml:space="preserve">    Service --&gt; User[Browser User]</w:t>
+        <w:t>Service --&gt; User[Browser User]</w:t>
       </w:r>
     </w:p>
     <w:p>
       <w:r>
-        <w:t xml:space="preserve">    App --&gt; RDS[PostgreSQL RDS]</w:t>
+        <w:t>App --&gt; RDS[PostgreSQL RDS]</w:t>
       </w:r>
     </w:p>
     <w:p>
       <w:r>
-        <w:t xml:space="preserve">    EKS --&gt; Prom[Prometheus]</w:t>
+        <w:t>EKS --&gt; Prom[Prometheus]</w:t>
       </w:r>
     </w:p>
     <w:p>
       <w:r>
-        <w:t xml:space="preserve">    Prom --&gt; Grafana[Grafana Dashboard]</w:t>
+        <w:t>Prom --&gt; Grafana[Grafana Dashboard]</w:t>
       </w:r>
     </w:p>
     <w:p>
-      <w:pPr>
-        <w:pStyle w:val="Heading2"/>
-      </w:pPr>
       <w:r>
         <w:t>Actual Flow</w:t>
       </w:r>
     </w:p>
     <w:p>
-      <w:pPr>
-        <w:pStyle w:val="ListNumber"/>
-      </w:pPr>
       <w:r>
         <w:t>1. Developer pushes application code to the `register-app` GitHub repository.</w:t>
       </w:r>
     </w:p>
     <w:p>
-      <w:pPr>
-        <w:pStyle w:val="ListNumber"/>
-      </w:pPr>
       <w:r>
         <w:t>2. GitHub triggers the Jenkins CI pipeline.</w:t>
       </w:r>
     </w:p>
     <w:p>
-      <w:pPr>
-        <w:pStyle w:val="ListNumber"/>
-      </w:pPr>
       <w:r>
         <w:t>3. Jenkins checks out the application and runs Maven build/tests.</w:t>
       </w:r>
     </w:p>
     <w:p>
-      <w:pPr>
-        <w:pStyle w:val="ListNumber"/>
-      </w:pPr>
       <w:r>
         <w:t>4. Jenkins runs SonarQube analysis.</w:t>
       </w:r>
     </w:p>
     <w:p>
-      <w:pPr>
-        <w:pStyle w:val="ListNumber"/>
-      </w:pPr>
       <w:r>
         <w:t>5. Jenkins builds a Docker image tagged with the release and build number.</w:t>
       </w:r>
     </w:p>
     <w:p>
-      <w:pPr>
-        <w:pStyle w:val="ListNumber"/>
-      </w:pPr>
       <w:r>
         <w:t>6. Trivy scans the image for high and critical vulnerabilities.</w:t>
       </w:r>
     </w:p>
     <w:p>
-      <w:pPr>
-        <w:pStyle w:val="ListNumber"/>
-      </w:pPr>
       <w:r>
         <w:t>7. Jenkins pushes the image to Docker Hub.</w:t>
       </w:r>
     </w:p>
     <w:p>
-      <w:pPr>
-        <w:pStyle w:val="ListNumber"/>
-      </w:pPr>
       <w:r>
-        <w:t>8. Jenkins checks out the `gitops-register-app` repository.</w:t>
+        <w:t>8. Jenkins checks out the `GitOps-Fashion-Signup-App` repository.</w:t>
       </w:r>
     </w:p>
     <w:p>
-      <w:pPr>
-        <w:pStyle w:val="ListNumber"/>
-      </w:pPr>
       <w:r>
         <w:t>9. Jenkins updates the image tag in Helm `values.yaml` and pushes that Git change.</w:t>
       </w:r>
     </w:p>
     <w:p>
-      <w:pPr>
-        <w:pStyle w:val="ListNumber"/>
-      </w:pPr>
       <w:r>
         <w:t>10. Argo CD detects the GitOps commit and reconciles the Helm chart.</w:t>
       </w:r>
     </w:p>
     <w:p>
-      <w:pPr>
-        <w:pStyle w:val="ListNumber"/>
-      </w:pPr>
       <w:r>
         <w:t>11. Kubernetes performs a Deployment rollout and starts new application pods.</w:t>
       </w:r>
     </w:p>
     <w:p>
-      <w:pPr>
-        <w:pStyle w:val="ListNumber"/>
-      </w:pPr>
       <w:r>
         <w:t>12. Prometheus collects cluster metrics and Grafana displays dashboards.</w:t>
       </w:r>
     </w:p>
     <w:p>
-      <w:pPr>
-        <w:pStyle w:val="ListNumber"/>
-      </w:pPr>
       <w:r>
         <w:t>13. The application connects to PostgreSQL RDS using Kubernetes Secret values.</w:t>
       </w:r>
     </w:p>
     <w:p>
-      <w:pPr>
-        <w:pStyle w:val="Heading2"/>
-      </w:pPr>
       <w:r>
         <w:t>Repository Responsibilities</w:t>
       </w:r>
     </w:p>
     <w:p>
-      <w:pPr>
-        <w:pStyle w:val="Heading3"/>
-      </w:pPr>
       <w:r>
         <w:t>Application repository</w:t>
       </w:r>
     </w:p>
     <w:p>
       <w:r>
-        <w:t>Location: `Git_Repos/register-app`</w:t>
+        <w:t>Location: `Git_Repos/Fashion-Register-App`</w:t>
       </w:r>
     </w:p>
     <w:p>
@@ -287,56 +235,38 @@
       </w:r>
     </w:p>
     <w:p>
-      <w:pPr>
-        <w:pStyle w:val="ListBullet"/>
-      </w:pPr>
       <w:r>
         <w:t>Maven project files</w:t>
       </w:r>
     </w:p>
     <w:p>
-      <w:pPr>
-        <w:pStyle w:val="ListBullet"/>
-      </w:pPr>
       <w:r>
         <w:t>Dockerfile</w:t>
       </w:r>
     </w:p>
     <w:p>
-      <w:pPr>
-        <w:pStyle w:val="ListBullet"/>
-      </w:pPr>
       <w:r>
         <w:t>CI Jenkinsfile</w:t>
       </w:r>
     </w:p>
     <w:p>
-      <w:pPr>
-        <w:pStyle w:val="ListBullet"/>
-      </w:pPr>
       <w:r>
         <w:t>application README</w:t>
       </w:r>
     </w:p>
     <w:p>
-      <w:pPr>
-        <w:pStyle w:val="ListBullet"/>
-      </w:pPr>
       <w:r>
         <w:t>database schema files</w:t>
       </w:r>
     </w:p>
     <w:p>
-      <w:pPr>
-        <w:pStyle w:val="Heading3"/>
-      </w:pPr>
       <w:r>
         <w:t>GitOps repository</w:t>
       </w:r>
     </w:p>
     <w:p>
       <w:r>
-        <w:t>Location: `Git_Repos/gitops-register-app`</w:t>
+        <w:t>Location: `Git_Repos/GitOps-Fashion-Signup-App`</w:t>
       </w:r>
     </w:p>
     <w:p>
@@ -353,168 +283,113 @@
       </w:r>
     </w:p>
     <w:p>
-      <w:pPr>
-        <w:pStyle w:val="ListBullet"/>
-      </w:pPr>
       <w:r>
         <w:t>`values.yaml`: deployment values, including image tag</w:t>
       </w:r>
     </w:p>
     <w:p>
-      <w:pPr>
-        <w:pStyle w:val="ListBullet"/>
-      </w:pPr>
       <w:r>
         <w:t>`templates/deployment.yaml`: Kubernetes Deployment template</w:t>
       </w:r>
     </w:p>
     <w:p>
-      <w:pPr>
-        <w:pStyle w:val="ListBullet"/>
-      </w:pPr>
       <w:r>
         <w:t>`templates/service.yaml`: Kubernetes Service template</w:t>
       </w:r>
     </w:p>
     <w:p>
       <w:r>
-        <w:t>The GitOps repository no longer contains the old CD Jenkinsfile. Argo CD is the deployment controller.</w:t>
+        <w:t>The GitOps repository no longer contains the old CD Jenkinsfile. Argo CD is the</w:t>
       </w:r>
     </w:p>
     <w:p>
-      <w:pPr>
-        <w:pStyle w:val="Heading2"/>
-      </w:pPr>
+      <w:r>
+        <w:t>deployment controller.</w:t>
+      </w:r>
+    </w:p>
+    <w:p>
       <w:r>
         <w:t>AWS Components Used</w:t>
       </w:r>
     </w:p>
     <w:p>
-      <w:pPr>
-        <w:pStyle w:val="ListBullet"/>
-      </w:pPr>
       <w:r>
         <w:t>EC2: Jenkins, SonarQube, and EKS bootstrap/admin access</w:t>
       </w:r>
     </w:p>
     <w:p>
-      <w:pPr>
-        <w:pStyle w:val="ListBullet"/>
-      </w:pPr>
       <w:r>
         <w:t>EKS: Kubernetes control plane and worker nodes</w:t>
       </w:r>
     </w:p>
     <w:p>
-      <w:pPr>
-        <w:pStyle w:val="ListBullet"/>
-      </w:pPr>
       <w:r>
         <w:t>VPC and subnets: network boundary for AWS resources</w:t>
       </w:r>
     </w:p>
     <w:p>
-      <w:pPr>
-        <w:pStyle w:val="ListBullet"/>
-      </w:pPr>
       <w:r>
         <w:t>Security groups: network access control</w:t>
       </w:r>
     </w:p>
     <w:p>
-      <w:pPr>
-        <w:pStyle w:val="ListBullet"/>
-      </w:pPr>
       <w:r>
         <w:t>RDS PostgreSQL: application database</w:t>
       </w:r>
     </w:p>
     <w:p>
-      <w:pPr>
-        <w:pStyle w:val="ListBullet"/>
-      </w:pPr>
       <w:r>
         <w:t>Load Balancers: public access to the application and Grafana</w:t>
       </w:r>
     </w:p>
     <w:p>
-      <w:pPr>
-        <w:pStyle w:val="ListBullet"/>
-      </w:pPr>
       <w:r>
         <w:t>S3: application image/static assets where applicable</w:t>
       </w:r>
     </w:p>
     <w:p>
-      <w:r/>
-    </w:p>
-    <w:p>
-      <w:pPr>
-        <w:pStyle w:val="Heading2"/>
-      </w:pPr>
       <w:r>
         <w:t>DevOps Ownership Model</w:t>
       </w:r>
     </w:p>
     <w:p>
-      <w:pPr>
-        <w:pStyle w:val="ListBullet"/>
-      </w:pPr>
       <w:r>
         <w:t>Jenkins owns build, test, analysis, image creation, and GitOps commit.</w:t>
       </w:r>
     </w:p>
     <w:p>
-      <w:pPr>
-        <w:pStyle w:val="ListBullet"/>
-      </w:pPr>
       <w:r>
         <w:t>GitHub stores the desired application version.</w:t>
       </w:r>
     </w:p>
     <w:p>
-      <w:pPr>
-        <w:pStyle w:val="ListBullet"/>
-      </w:pPr>
       <w:r>
         <w:t>Argo CD owns Kubernetes reconciliation.</w:t>
       </w:r>
     </w:p>
     <w:p>
-      <w:pPr>
-        <w:pStyle w:val="ListBullet"/>
-      </w:pPr>
       <w:r>
         <w:t>Kubernetes owns scheduling and rollout of pods.</w:t>
       </w:r>
     </w:p>
     <w:p>
-      <w:pPr>
-        <w:pStyle w:val="ListBullet"/>
-      </w:pPr>
       <w:r>
         <w:t>Prometheus owns metrics collection.</w:t>
       </w:r>
     </w:p>
     <w:p>
-      <w:pPr>
-        <w:pStyle w:val="ListBullet"/>
-      </w:pPr>
       <w:r>
         <w:t>Grafana owns metrics visualization.</w:t>
       </w:r>
     </w:p>
     <w:p>
-      <w:pPr>
-        <w:pStyle w:val="ListBullet"/>
-      </w:pPr>
       <w:r>
         <w:t>RDS owns persistent relational data.</w:t>
       </w:r>
     </w:p>
     <w:sectPr>
       <w:pgSz w:w="12240" w:h="15840"/>
-      <w:pgMar w:top="1440" w:right="1800" w:bottom="1440" w:left="1800" w:header="720" w:footer="720" w:gutter="0"/>
+      <w:pgMar w:top="1008" w:right="1152" w:bottom="1008" w:left="1152" w:header="720" w:footer="720" w:gutter="0"/>
       <w:cols w:space="720"/>
       <w:docGrid w:linePitch="360"/>
     </w:sectPr>
@@ -885,6 +760,10 @@
     <w:name w:val="Normal"/>
     <w:qFormat/>
     <w:rsid w:val="00FC693F"/>
+    <w:rPr>
+      <w:rFonts w:ascii="Aptos" w:hAnsi="Aptos"/>
+      <w:sz w:val="20"/>
+    </w:rPr>
   </w:style>
   <w:style w:type="paragraph" w:styleId="Header">
     <w:name w:val="header"/>

</xml_diff>